<commit_message>
Update Gate 0 document
</commit_message>
<xml_diff>
--- a/docs/Subscription_Renewal_Eligibility_Register_Gate_0.docx
+++ b/docs/Subscription_Renewal_Eligibility_Register_Gate_0.docx
@@ -216,7 +216,14 @@
           <w:sz w:val="28"/>
           <w:szCs w:val="28"/>
         </w:rPr>
-        <w:t>ao</w:t>
+        <w:t>a</w:t>
+      </w:r>
+      <w:r>
+        <w:rPr>
+          <w:sz w:val="28"/>
+          <w:szCs w:val="28"/>
+        </w:rPr>
+        <w:t>o</w:t>
       </w:r>
       <w:r>
         <w:rPr>

</xml_diff>